<commit_message>
Agrega puntos 15 y 16, checklist actualizado y ajustes de coherencia
Mobiliario, equipamiento y materiales; disposiciones de ejecución con el
cuadro de equivalencias 2013-2027. Se actualizan los puntos 8, 10, 11, 13 y
14 con el relevamiento de octubre de 2026 y la regla de transición, y se
entrega el checklist de entregas con observaciones y fuentes.

Co-Authored-By: Claude Opus 5.5 <noreply@anthropic.com>
Claude-Session: https://claude.ai/code/session_01Li7yxA95TVg4oPXuqG5DZe
</commit_message>
<xml_diff>
--- a/rediseno_2026/14. Infraestructura y equipamiento.docx
+++ b/rediseno_2026/14. Infraestructura y equipamiento.docx
@@ -4013,7 +4013,7 @@
           <w:i w:val="0"/>
           <w:sz w:val="20"/>
         </w:rPr>
-        <w:t>La Carrera cuenta con dos laboratorios de computación: el del Edificio Nava Morales, en el cuarto piso, con 61 m² y capacidad para 70 estudiantes, y el del Monoblock Central, en planta baja, con 50 m² y capacidad para 36 estudiantes, de los cuales 20 puestos están completos según el inventario. Su equipamiento y software se detallan en los puntos 10.4, 10.7 y 10.8. La Carrera no cuenta con talleres ni salas de simulación para el trabajo en equipo; su habilitación forma parte de los requerimientos de mediano plazo del punto 11.1.4.</w:t>
+        <w:t>La Carrera cuenta con dos laboratorios de computación: el del Edificio Nava Morales, en el cuarto piso, con 61 m² y capacidad para 70 estudiantes, y el del Monoblock Central, en planta baja, con 50 m² y capacidad para 36 estudiantes, donde 24 de las 27 computadoras están en mal estado según el relevamiento de octubre de 2026. Su equipamiento y software se detallan en los puntos 10.4, 10.7 y 10.8. La Carrera no cuenta con talleres ni salas de simulación para el trabajo en equipo; su habilitación forma parte de los requerimientos de mediano plazo del punto 11.1.4.</w:t>
       </w:r>
     </w:p>
     <w:p>
@@ -4992,7 +4992,7 @@
           <w:i w:val="0"/>
           <w:sz w:val="20"/>
         </w:rPr>
-        <w:t>Las computadoras estacionarias de uso académico se concentran en los dos laboratorios, con 70 equipos en el Edificio Nava Morales y 39 en el Monoblock Central según el Diagnóstico 2026, todos conectados en red con acceso a internet. El Centro de Cómputo, en la Av. Villazón, cuenta con el gabinete de red desde el que se distribuye el servicio de internet a todos los predios, tres impresoras, un escáner de alta velocidad y cuatro computadoras. El inventario no registra computadoras portátiles para uso académico; su adquisición para préstamo a docentes y para actividades en aula complementaría los laboratorios.</w:t>
+        <w:t>Las computadoras estacionarias de uso académico se concentran en los dos laboratorios, conectados en red con acceso a internet: 70 en el Edificio Nava Morales y 27 en el Monoblock Central, de las cuales 24 están en mal estado. El laboratorio del Monoblock dispone además de seis computadoras portátiles para préstamo, dos de ellas inutilizables, y la Carrera entrega computadoras portátiles a los docentes para el uso en aula. El Centro de Cómputo, en la Av. Villazón, cuenta con el gabinete de red desde el que se distribuye el servicio de internet a todos los predios, tres impresoras, un escáner de alta velocidad y cuatro computadoras. Según el relevamiento del punto 15, el 90 % de los equipos de computación de ambos edificios ya cumplió su ciclo de vida, por lo que su renovación integral es un requerimiento de corto plazo.</w:t>
       </w:r>
     </w:p>
     <w:p>
@@ -6611,7 +6611,7 @@
           <w:i w:val="0"/>
           <w:sz w:val="20"/>
         </w:rPr>
-        <w:t>Para las actividades académicas, culturales y de interacción social, la Carrera dispone del auditorio del Edificio Nava Morales, en el segundo piso, con 247 m² y capacidad para 220 personas, equipado con sistema de sonido y cuatro cámaras de seguridad, y de los pabellones del Monoblock Central para eventos de mayor convocatoria. El inventario de la Carrera no registra áreas deportivas propias. Para la consultoría social contable y las campañas del punto 7 se requiere un ambiente de atención al público con acceso independiente.</w:t>
+        <w:t>Para las actividades académicas, culturales y de interacción social, la Carrera dispone del auditorio del Edificio Nava Morales, en el segundo piso, con 247 m² y capacidad para 220 personas, equipado con sistema de sonido y cuatro cámaras de seguridad, y de los pabellones del Monoblock Central para eventos de mayor convocatoria. Para las actividades deportivas, docentes, estudiantes y administrativos utilizan de forma compartida la cancha polifuncional del Edificio Nava Morales, el Coliseo de la UMSA, en la calle Federico Zuazo, y las instalaciones del Campus Universitario de Cota Cota. Para la consultoría social contable y las campañas del punto 7 se requiere un ambiente de atención al público con acceso independiente.</w:t>
       </w:r>
     </w:p>
     <w:p>
@@ -6656,7 +6656,7 @@
           <w:i w:val="0"/>
           <w:sz w:val="20"/>
         </w:rPr>
-        <w:t>Las fuentes del rediseño no registran el inventario de los servicios sanitarios de los edificios Nava Morales y Monoblock Central. La Dirección de Carrera lo completará con la unidad de infraestructura de la Universidad, diferenciando los servicios para docentes, estudiantes y administrativos, su número por piso y su accesibilidad para personas con discapacidad, y lo incorporará al plan de mantenimiento del punto 11.3.2.</w:t>
+        <w:t>En el Edificio Nava Morales, la Carrera dispone de baños de uso exclusivo para damas y para varones en el primer y en el cuarto piso, que atienden a docentes y estudiantes. En el Monoblock Central, el personal utiliza los servicios del tercer piso y los estudiantes, los del segundo patio del edificio. El relevamiento del punto 15 constata que los baños, en particular los de damas, colapsan después de cada cambio de clase, por lo que se recomienda prever su ampliación previo un estudio de ingeniería, con servicios accesibles para personas con discapacidad, e incorporarlos al plan de mantenimiento del punto 11.3.2.</w:t>
       </w:r>
     </w:p>
     <w:p>

</xml_diff>